<commit_message>
update base dataabase postgreSQL
</commit_message>
<xml_diff>
--- a/reports/Build_CameraSimulator_VideosService_AIservice.docx
+++ b/reports/Build_CameraSimulator_VideosService_AIservice.docx
@@ -2066,29 +2066,14 @@
       </w:r>
     </w:p>
     <w:p>
+      <w:r>
+        <w:t>Trong giai đoạn phát triển prototype, hệ thống chưa có camera IP vật lý để cung cấp luồng video theo thời gian thực. Trong khi đó, Video Service cần được xây dựng và kiểm thử với nguồn đầu vào có đặc điểm gần với camera thực tế, bao gồm khả năng kết nối stream, nhận video liên tục, xử lý nhiều camera và phục hồi kết nối khi stream bị gián đoạn.</w:t>
+      </w:r>
+    </w:p>
+    <w:p>
       <w:pPr>
         <w:pStyle w:val="Heading3"/>
         <w:rPr>
-          <w:rFonts w:asciiTheme="majorHAnsi" w:eastAsiaTheme="minorHAnsi" w:hAnsiTheme="majorHAnsi" w:cstheme="majorHAnsi"/>
-          <w:color w:val="auto"/>
-          <w:sz w:val="26"/>
-          <w:szCs w:val="26"/>
-        </w:rPr>
-      </w:pPr>
-      <w:r>
-        <w:rPr>
-          <w:rFonts w:asciiTheme="majorHAnsi" w:eastAsiaTheme="minorHAnsi" w:hAnsiTheme="majorHAnsi" w:cstheme="majorHAnsi"/>
-          <w:color w:val="auto"/>
-          <w:sz w:val="26"/>
-          <w:szCs w:val="26"/>
-        </w:rPr>
-        <w:t>Trong giai đoạn phát triển prototype, hệ thống chưa có camera IP vật lý để cung cấp luồng video theo thời gian thực. Trong khi đó, Video Service cần được xây dựng và kiểm thử với nguồn đầu vào có đặc điểm gần với camera thực tế, bao gồm khả năng kết nối stream, nhận video liên tục, xử lý nhiều camera và phục hồi kết nối khi stream bị gián đoạn.</w:t>
-      </w:r>
-    </w:p>
-    <w:p>
-      <w:pPr>
-        <w:pStyle w:val="Heading3"/>
-        <w:rPr>
           <w:rFonts w:asciiTheme="majorHAnsi" w:hAnsiTheme="majorHAnsi" w:cstheme="majorHAnsi"/>
           <w:sz w:val="26"/>
           <w:szCs w:val="26"/>
@@ -2112,19 +2097,7 @@
       </w:r>
     </w:p>
     <w:p>
-      <w:pPr>
-        <w:rPr>
-          <w:rFonts w:asciiTheme="majorHAnsi" w:hAnsiTheme="majorHAnsi" w:cstheme="majorHAnsi"/>
-          <w:sz w:val="26"/>
-          <w:szCs w:val="26"/>
-        </w:rPr>
-      </w:pPr>
-      <w:r>
-        <w:rPr>
-          <w:rFonts w:asciiTheme="majorHAnsi" w:hAnsiTheme="majorHAnsi" w:cstheme="majorHAnsi"/>
-          <w:sz w:val="26"/>
-          <w:szCs w:val="26"/>
-        </w:rPr>
+      <w:r>
         <w:t xml:space="preserve">Trong giai đoạn này chưa có camera thật, hệ thống dùng hai video trong thự mực code/data/videos để mô phỏng hai camera. </w:t>
       </w:r>
     </w:p>
@@ -4953,16 +4926,7 @@
     </w:p>
     <w:p>
       <w:r>
-        <w:t>Để thuận tiện cho quá trình truyền qua WebSocket, frame được nén dưới dạng JPEG và mã hóa Base64.</w:t>
-      </w:r>
-      <w:r>
-        <w:t xml:space="preserve"> </w:t>
-      </w:r>
-      <w:r>
-        <w:t xml:space="preserve">Sau khi AI Service nhận dữ liệu, ảnh được chuyển về định dạng mà YOLO có thể xử </w:t>
-      </w:r>
-      <w:r>
-        <w:t>lý.</w:t>
+        <w:t>Để thuận tiện cho quá trình truyền qua WebSocket, frame được nén dưới dạng JPEG và mã hóa Base64. Sau khi AI Service nhận dữ liệu, ảnh được chuyển về định dạng mà YOLO có thể xử lý.</w:t>
       </w:r>
     </w:p>
     <w:p>
@@ -4991,6 +4955,7 @@
         <w:rPr>
           <w:b/>
           <w:bCs/>
+          <w:noProof/>
         </w:rPr>
         <w:drawing>
           <wp:inline distT="0" distB="0" distL="0" distR="0" wp14:anchorId="739B0328" wp14:editId="08E3774B">
@@ -5031,22 +4996,7 @@
     </w:p>
     <w:p>
       <w:r>
-        <w:t xml:space="preserve">Trong hệ thống hiện tại, hệ thống chỉ sử dụng 2 lớp “person” và “car”. Mỗi detection sau inference bao gồm: </w:t>
-      </w:r>
-      <w:r>
-        <w:t>class_</w:t>
-      </w:r>
-      <w:r>
-        <w:t xml:space="preserve">id, </w:t>
-      </w:r>
-      <w:r>
-        <w:t>class_</w:t>
-      </w:r>
-      <w:r>
-        <w:t xml:space="preserve">name, confidence, </w:t>
-      </w:r>
-      <w:r>
-        <w:t>bbox_xyxy</w:t>
+        <w:t>Trong hệ thống hiện tại, hệ thống chỉ sử dụng 2 lớp “person” và “car”. Mỗi detection sau inference bao gồm: class_id, class_name, confidence, bbox_xyxy</w:t>
       </w:r>
     </w:p>
     <w:p>
@@ -5099,39 +5049,12 @@
           <w:i/>
           <w:iCs/>
         </w:rPr>
-        <w:t xml:space="preserve">class, Confidence, </w:t>
-      </w:r>
-      <w:r>
-        <w:rPr>
-          <w:i/>
-          <w:iCs/>
-        </w:rPr>
-        <w:t>bbox c</w:t>
-      </w:r>
-      <w:r>
-        <w:rPr>
-          <w:i/>
-          <w:iCs/>
-        </w:rPr>
-        <w:t xml:space="preserve">oordinates, </w:t>
-      </w:r>
-      <w:r>
-        <w:rPr>
-          <w:i/>
-          <w:iCs/>
-        </w:rPr>
-        <w:t>frame metadata</w:t>
-      </w:r>
-    </w:p>
-    <w:p>
-      <w:r>
-        <w:t>Web Viewer đã nhận được ảnh từ Viewer Branch nên không cần nhận lại một bản ảnh khác từ AI Service.</w:t>
-      </w:r>
-      <w:r>
-        <w:t xml:space="preserve"> </w:t>
-      </w:r>
-      <w:r>
-        <w:t>Viewer chỉ cần sử dụng tọa độ bounding box để vẽ lên frame thông qua Canvas.</w:t>
+        <w:t>class, Confidence, bbox coordinates, frame metadata</w:t>
+      </w:r>
+    </w:p>
+    <w:p>
+      <w:r>
+        <w:t>Web Viewer đã nhận được ảnh từ Viewer Branch nên không cần nhận lại một bản ảnh khác từ AI Service. Viewer chỉ cần sử dụng tọa độ bounding box để vẽ lên frame thông qua Canvas.</w:t>
       </w:r>
     </w:p>
     <w:p>
@@ -5233,6 +5156,85 @@
           <w:szCs w:val="26"/>
         </w:rPr>
         <w:t>4.5. Xây dựng Zone</w:t>
+      </w:r>
+    </w:p>
+    <w:p>
+      <w:r>
+        <w:drawing>
+          <wp:inline distT="0" distB="0" distL="0" distR="0" wp14:anchorId="49BC717A" wp14:editId="27769FEE">
+            <wp:extent cx="5731510" cy="1871345"/>
+            <wp:effectExtent l="0" t="0" r="2540" b="0"/>
+            <wp:docPr id="1983390443" name="Picture 1"/>
+            <wp:cNvGraphicFramePr>
+              <a:graphicFrameLocks xmlns:a="http://schemas.openxmlformats.org/drawingml/2006/main" noChangeAspect="1"/>
+            </wp:cNvGraphicFramePr>
+            <a:graphic xmlns:a="http://schemas.openxmlformats.org/drawingml/2006/main">
+              <a:graphicData uri="http://schemas.openxmlformats.org/drawingml/2006/picture">
+                <pic:pic xmlns:pic="http://schemas.openxmlformats.org/drawingml/2006/picture">
+                  <pic:nvPicPr>
+                    <pic:cNvPr id="1983390443" name=""/>
+                    <pic:cNvPicPr/>
+                  </pic:nvPicPr>
+                  <pic:blipFill>
+                    <a:blip r:embed="rId11"/>
+                    <a:stretch>
+                      <a:fillRect/>
+                    </a:stretch>
+                  </pic:blipFill>
+                  <pic:spPr>
+                    <a:xfrm>
+                      <a:off x="0" y="0"/>
+                      <a:ext cx="5731510" cy="1871345"/>
+                    </a:xfrm>
+                    <a:prstGeom prst="rect">
+                      <a:avLst/>
+                    </a:prstGeom>
+                  </pic:spPr>
+                </pic:pic>
+              </a:graphicData>
+            </a:graphic>
+          </wp:inline>
+        </w:drawing>
+      </w:r>
+    </w:p>
+    <w:p/>
+    <w:p>
+      <w:r>
+        <w:drawing>
+          <wp:inline distT="0" distB="0" distL="0" distR="0" wp14:anchorId="5865940F" wp14:editId="3CB95E21">
+            <wp:extent cx="5731510" cy="2425700"/>
+            <wp:effectExtent l="0" t="0" r="2540" b="0"/>
+            <wp:docPr id="1197220481" name="Picture 1"/>
+            <wp:cNvGraphicFramePr>
+              <a:graphicFrameLocks xmlns:a="http://schemas.openxmlformats.org/drawingml/2006/main" noChangeAspect="1"/>
+            </wp:cNvGraphicFramePr>
+            <a:graphic xmlns:a="http://schemas.openxmlformats.org/drawingml/2006/main">
+              <a:graphicData uri="http://schemas.openxmlformats.org/drawingml/2006/picture">
+                <pic:pic xmlns:pic="http://schemas.openxmlformats.org/drawingml/2006/picture">
+                  <pic:nvPicPr>
+                    <pic:cNvPr id="1197220481" name=""/>
+                    <pic:cNvPicPr/>
+                  </pic:nvPicPr>
+                  <pic:blipFill>
+                    <a:blip r:embed="rId12"/>
+                    <a:stretch>
+                      <a:fillRect/>
+                    </a:stretch>
+                  </pic:blipFill>
+                  <pic:spPr>
+                    <a:xfrm>
+                      <a:off x="0" y="0"/>
+                      <a:ext cx="5731510" cy="2425700"/>
+                    </a:xfrm>
+                    <a:prstGeom prst="rect">
+                      <a:avLst/>
+                    </a:prstGeom>
+                  </pic:spPr>
+                </pic:pic>
+              </a:graphicData>
+            </a:graphic>
+          </wp:inline>
+        </w:drawing>
       </w:r>
     </w:p>
     <w:p>

</xml_diff>